<commit_message>
adds guide and feature files
</commit_message>
<xml_diff>
--- a/src/Annotation Guide.docx
+++ b/src/Annotation Guide.docx
@@ -2996,25 +2996,7 @@
             <w:sz w:val="22"/>
             <w:szCs w:val="22"/>
           </w:rPr>
-          <w:t>S</w:t>
-        </w:r>
-        <w:r>
-          <w:rPr>
-            <w:rStyle w:val="Lienhypertexte"/>
-            <w:rFonts w:ascii="Times New Roman" w:hAnsi="Times New Roman" w:cs="Times New Roman"/>
-            <w:sz w:val="22"/>
-            <w:szCs w:val="22"/>
-          </w:rPr>
-          <w:t>F</w:t>
-        </w:r>
-        <w:r>
-          <w:rPr>
-            <w:rStyle w:val="Lienhypertexte"/>
-            <w:rFonts w:ascii="Times New Roman" w:hAnsi="Times New Roman" w:cs="Times New Roman"/>
-            <w:sz w:val="22"/>
-            <w:szCs w:val="22"/>
-          </w:rPr>
-          <w:t>onto</w:t>
+          <w:t>SFonto</w:t>
         </w:r>
         <w:proofErr w:type="spellEnd"/>
       </w:hyperlink>
@@ -3717,15 +3699,7 @@
           <w:sz w:val="22"/>
           <w:szCs w:val="22"/>
         </w:rPr>
-        <w:t xml:space="preserve"> lieux étant </w:t>
-      </w:r>
-      <w:r>
-        <w:rPr>
-          <w:rFonts w:ascii="Times New Roman" w:hAnsi="Times New Roman" w:cs="Times New Roman"/>
-          <w:sz w:val="22"/>
-          <w:szCs w:val="22"/>
-        </w:rPr>
-        <w:t xml:space="preserve">dans le fichier </w:t>
+        <w:t xml:space="preserve"> lieux étant dans le fichier </w:t>
       </w:r>
       <w:hyperlink r:id="rId9" w:history="1">
         <w:proofErr w:type="spellStart"/>
@@ -4033,15 +4007,7 @@
           <w:sz w:val="22"/>
           <w:szCs w:val="22"/>
         </w:rPr>
-        <w:t xml:space="preserve">P2_has_feature </w:t>
-      </w:r>
-      <w:r>
-        <w:rPr>
-          <w:rFonts w:ascii="Times New Roman" w:hAnsi="Times New Roman" w:cs="Times New Roman"/>
-          <w:sz w:val="22"/>
-          <w:szCs w:val="22"/>
-        </w:rPr>
-        <w:t xml:space="preserve">(un type </w:t>
+        <w:t xml:space="preserve">P2_has_feature (un type </w:t>
       </w:r>
       <w:r>
         <w:rPr>
@@ -4237,15 +4203,7 @@
           <w:sz w:val="22"/>
           <w:szCs w:val="22"/>
         </w:rPr>
-        <w:t xml:space="preserve">P2_has_feature </w:t>
-      </w:r>
-      <w:r>
-        <w:rPr>
-          <w:rFonts w:ascii="Times New Roman" w:hAnsi="Times New Roman" w:cs="Times New Roman"/>
-          <w:sz w:val="22"/>
-          <w:szCs w:val="22"/>
-        </w:rPr>
-        <w:t xml:space="preserve">(un type </w:t>
+        <w:t xml:space="preserve">P2_has_feature (un type </w:t>
       </w:r>
       <w:r>
         <w:rPr>
@@ -4263,23 +4221,7 @@
           <w:sz w:val="22"/>
           <w:szCs w:val="22"/>
         </w:rPr>
-        <w:t xml:space="preserve"> d</w:t>
-      </w:r>
-      <w:r>
-        <w:rPr>
-          <w:rFonts w:ascii="Times New Roman" w:hAnsi="Times New Roman" w:cs="Times New Roman"/>
-          <w:sz w:val="22"/>
-          <w:szCs w:val="22"/>
-        </w:rPr>
-        <w:t>’organisation</w:t>
-      </w:r>
-      <w:r>
-        <w:rPr>
-          <w:rFonts w:ascii="Times New Roman" w:hAnsi="Times New Roman" w:cs="Times New Roman"/>
-          <w:sz w:val="22"/>
-          <w:szCs w:val="22"/>
-        </w:rPr>
-        <w:t>, la liste finie des</w:t>
+        <w:t xml:space="preserve"> d’organisation, la liste finie des</w:t>
       </w:r>
       <w:r>
         <w:rPr>
@@ -4646,23 +4588,7 @@
           <w:sz w:val="22"/>
           <w:szCs w:val="22"/>
         </w:rPr>
-        <w:t xml:space="preserve"> </w:t>
-      </w:r>
-      <w:r>
-        <w:rPr>
-          <w:rFonts w:ascii="Times New Roman" w:hAnsi="Times New Roman" w:cs="Times New Roman"/>
-          <w:sz w:val="22"/>
-          <w:szCs w:val="22"/>
-        </w:rPr>
-        <w:t>de communauté</w:t>
-      </w:r>
-      <w:r>
-        <w:rPr>
-          <w:rFonts w:ascii="Times New Roman" w:hAnsi="Times New Roman" w:cs="Times New Roman"/>
-          <w:sz w:val="22"/>
-          <w:szCs w:val="22"/>
-        </w:rPr>
-        <w:t>, la liste finie des</w:t>
+        <w:t xml:space="preserve"> de communauté, la liste finie des</w:t>
       </w:r>
       <w:r>
         <w:rPr>
@@ -4957,23 +4883,7 @@
           <w:sz w:val="22"/>
           <w:szCs w:val="22"/>
         </w:rPr>
-        <w:t xml:space="preserve"> </w:t>
-      </w:r>
-      <w:r>
-        <w:rPr>
-          <w:rFonts w:ascii="Times New Roman" w:hAnsi="Times New Roman" w:cs="Times New Roman"/>
-          <w:sz w:val="22"/>
-          <w:szCs w:val="22"/>
-        </w:rPr>
-        <w:t>de groupe</w:t>
-      </w:r>
-      <w:r>
-        <w:rPr>
-          <w:rFonts w:ascii="Times New Roman" w:hAnsi="Times New Roman" w:cs="Times New Roman"/>
-          <w:sz w:val="22"/>
-          <w:szCs w:val="22"/>
-        </w:rPr>
-        <w:t>, la liste finie des</w:t>
+        <w:t xml:space="preserve"> de groupe, la liste finie des</w:t>
       </w:r>
       <w:r>
         <w:rPr>
@@ -5137,23 +5047,7 @@
           <w:sz w:val="22"/>
           <w:szCs w:val="22"/>
         </w:rPr>
-        <w:t xml:space="preserve"> </w:t>
-      </w:r>
-      <w:r>
-        <w:rPr>
-          <w:rFonts w:ascii="Times New Roman" w:hAnsi="Times New Roman" w:cs="Times New Roman"/>
-          <w:sz w:val="22"/>
-          <w:szCs w:val="22"/>
-        </w:rPr>
-        <w:t>peuvent être écrites sous n’importe quelle forme</w:t>
-      </w:r>
-      <w:r>
-        <w:rPr>
-          <w:rFonts w:ascii="Times New Roman" w:hAnsi="Times New Roman" w:cs="Times New Roman"/>
-          <w:sz w:val="22"/>
-          <w:szCs w:val="22"/>
-        </w:rPr>
-        <w:t>.</w:t>
+        <w:t xml:space="preserve"> peuvent être écrites sous n’importe quelle forme.</w:t>
       </w:r>
     </w:p>
     <w:p>
@@ -5284,31 +5178,7 @@
           <w:sz w:val="22"/>
           <w:szCs w:val="22"/>
         </w:rPr>
-        <w:t xml:space="preserve"> d’objet</w:t>
-      </w:r>
-      <w:r>
-        <w:rPr>
-          <w:rFonts w:ascii="Times New Roman" w:hAnsi="Times New Roman" w:cs="Times New Roman"/>
-          <w:sz w:val="22"/>
-          <w:szCs w:val="22"/>
-        </w:rPr>
-        <w:t xml:space="preserve">, la liste finie des </w:t>
-      </w:r>
-      <w:r>
-        <w:rPr>
-          <w:rFonts w:ascii="Times New Roman" w:hAnsi="Times New Roman" w:cs="Times New Roman"/>
-          <w:sz w:val="22"/>
-          <w:szCs w:val="22"/>
-        </w:rPr>
-        <w:t>types d’objets</w:t>
-      </w:r>
-      <w:r>
-        <w:rPr>
-          <w:rFonts w:ascii="Times New Roman" w:hAnsi="Times New Roman" w:cs="Times New Roman"/>
-          <w:sz w:val="22"/>
-          <w:szCs w:val="22"/>
-        </w:rPr>
-        <w:t xml:space="preserve"> étant dans le fichier </w:t>
+        <w:t xml:space="preserve"> d’objet, la liste finie des types d’objets étant dans le fichier </w:t>
       </w:r>
       <w:hyperlink r:id="rId14" w:history="1">
         <w:proofErr w:type="spellStart"/>
@@ -5582,23 +5452,7 @@
           <w:sz w:val="22"/>
           <w:szCs w:val="22"/>
         </w:rPr>
-        <w:t>« </w:t>
-      </w:r>
-      <w:r>
-        <w:rPr>
-          <w:rFonts w:ascii="Times New Roman" w:hAnsi="Times New Roman" w:cs="Times New Roman"/>
-          <w:sz w:val="22"/>
-          <w:szCs w:val="22"/>
-        </w:rPr>
-        <w:t>Narrative Events</w:t>
-      </w:r>
-      <w:r>
-        <w:rPr>
-          <w:rFonts w:ascii="Times New Roman" w:hAnsi="Times New Roman" w:cs="Times New Roman"/>
-          <w:sz w:val="22"/>
-          <w:szCs w:val="22"/>
-        </w:rPr>
-        <w:t> »</w:t>
+        <w:t>« Narrative Events »</w:t>
       </w:r>
       <w:r>
         <w:rPr>
@@ -5742,15 +5596,7 @@
           <w:sz w:val="22"/>
           <w:szCs w:val="22"/>
         </w:rPr>
-        <w:t> »</w:t>
-      </w:r>
-      <w:r>
-        <w:rPr>
-          <w:rFonts w:ascii="Times New Roman" w:hAnsi="Times New Roman" w:cs="Times New Roman"/>
-          <w:sz w:val="22"/>
-          <w:szCs w:val="22"/>
-        </w:rPr>
-        <w:t xml:space="preserve"> de l’Excel les péripéties</w:t>
+        <w:t> » de l’Excel les péripéties</w:t>
       </w:r>
       <w:r>
         <w:rPr>
@@ -5803,15 +5649,7 @@
           <w:sz w:val="22"/>
           <w:szCs w:val="22"/>
         </w:rPr>
-        <w:t xml:space="preserve">Annoter dans l’onglet </w:t>
-      </w:r>
-      <w:r>
-        <w:rPr>
-          <w:rFonts w:ascii="Times New Roman" w:hAnsi="Times New Roman" w:cs="Times New Roman"/>
-          <w:sz w:val="22"/>
-          <w:szCs w:val="22"/>
-        </w:rPr>
-        <w:t>« </w:t>
+        <w:t>Annoter dans l’onglet « </w:t>
       </w:r>
       <w:proofErr w:type="spellStart"/>
       <w:r>
@@ -5829,15 +5667,7 @@
           <w:sz w:val="22"/>
           <w:szCs w:val="22"/>
         </w:rPr>
-        <w:t> »</w:t>
-      </w:r>
-      <w:r>
-        <w:rPr>
-          <w:rFonts w:ascii="Times New Roman" w:hAnsi="Times New Roman" w:cs="Times New Roman"/>
-          <w:sz w:val="22"/>
-          <w:szCs w:val="22"/>
-        </w:rPr>
-        <w:t xml:space="preserve"> de l’Excel les motifs narratifs (classe </w:t>
+        <w:t xml:space="preserve"> » de l’Excel les motifs narratifs (classe </w:t>
       </w:r>
       <w:r>
         <w:rPr>
@@ -5876,15 +5706,7 @@
           <w:szCs w:val="22"/>
         </w:rPr>
         <w:lastRenderedPageBreak/>
-        <w:t xml:space="preserve">Annoter dans l’onglet </w:t>
-      </w:r>
-      <w:r>
-        <w:rPr>
-          <w:rFonts w:ascii="Times New Roman" w:hAnsi="Times New Roman" w:cs="Times New Roman"/>
-          <w:sz w:val="22"/>
-          <w:szCs w:val="22"/>
-        </w:rPr>
-        <w:t xml:space="preserve">« Narrative </w:t>
+        <w:t xml:space="preserve">Annoter dans l’onglet « Narrative </w:t>
       </w:r>
       <w:proofErr w:type="spellStart"/>
       <w:r>
@@ -5902,15 +5724,7 @@
           <w:sz w:val="22"/>
           <w:szCs w:val="22"/>
         </w:rPr>
-        <w:t> »</w:t>
-      </w:r>
-      <w:r>
-        <w:rPr>
-          <w:rFonts w:ascii="Times New Roman" w:hAnsi="Times New Roman" w:cs="Times New Roman"/>
-          <w:sz w:val="22"/>
-          <w:szCs w:val="22"/>
-        </w:rPr>
-        <w:t xml:space="preserve"> de l’Excel les séquences narratives (classe </w:t>
+        <w:t xml:space="preserve"> » de l’Excel les séquences narratives (classe </w:t>
       </w:r>
       <w:r>
         <w:rPr>
@@ -6535,23 +6349,7 @@
           <w:sz w:val="22"/>
           <w:szCs w:val="22"/>
         </w:rPr>
-        <w:t xml:space="preserve">, la liste finie des </w:t>
-      </w:r>
-      <w:r>
-        <w:rPr>
-          <w:rFonts w:ascii="Times New Roman" w:hAnsi="Times New Roman" w:cs="Times New Roman"/>
-          <w:sz w:val="22"/>
-          <w:szCs w:val="22"/>
-        </w:rPr>
-        <w:t>fonctions narratives</w:t>
-      </w:r>
-      <w:r>
-        <w:rPr>
-          <w:rFonts w:ascii="Times New Roman" w:hAnsi="Times New Roman" w:cs="Times New Roman"/>
-          <w:sz w:val="22"/>
-          <w:szCs w:val="22"/>
-        </w:rPr>
-        <w:t xml:space="preserve"> étant dans le fichier </w:t>
+        <w:t xml:space="preserve">, la liste finie des fonctions narratives étant dans le fichier </w:t>
       </w:r>
       <w:hyperlink r:id="rId15" w:history="1">
         <w:proofErr w:type="spellStart"/>
@@ -6752,7 +6550,23 @@
           <w:sz w:val="22"/>
           <w:szCs w:val="22"/>
         </w:rPr>
-        <w:t xml:space="preserve">Il n’y a que deux instances possibles de </w:t>
+        <w:t xml:space="preserve">Il y a </w:t>
+      </w:r>
+      <w:r>
+        <w:rPr>
+          <w:rFonts w:ascii="Times New Roman" w:hAnsi="Times New Roman" w:cs="Times New Roman"/>
+          <w:sz w:val="22"/>
+          <w:szCs w:val="22"/>
+        </w:rPr>
+        <w:t>au moins</w:t>
+      </w:r>
+      <w:r>
+        <w:rPr>
+          <w:rFonts w:ascii="Times New Roman" w:hAnsi="Times New Roman" w:cs="Times New Roman"/>
+          <w:sz w:val="22"/>
+          <w:szCs w:val="22"/>
+        </w:rPr>
+        <w:t xml:space="preserve"> deux instances possibles de </w:t>
       </w:r>
       <w:r>
         <w:rPr>
@@ -6763,6 +6577,58 @@
           <w:szCs w:val="22"/>
         </w:rPr>
         <w:t>G7_Narrative_Sequence</w:t>
+      </w:r>
+      <w:r>
+        <w:rPr>
+          <w:rFonts w:ascii="Times New Roman" w:hAnsi="Times New Roman" w:cs="Times New Roman"/>
+          <w:sz w:val="22"/>
+          <w:szCs w:val="22"/>
+        </w:rPr>
+        <w:t xml:space="preserve"> (fabula et </w:t>
+      </w:r>
+      <w:proofErr w:type="spellStart"/>
+      <w:r>
+        <w:rPr>
+          <w:rFonts w:ascii="Times New Roman" w:hAnsi="Times New Roman" w:cs="Times New Roman"/>
+          <w:sz w:val="22"/>
+          <w:szCs w:val="22"/>
+        </w:rPr>
+        <w:t>syuzhet</w:t>
+      </w:r>
+      <w:proofErr w:type="spellEnd"/>
+      <w:r>
+        <w:rPr>
+          <w:rFonts w:ascii="Times New Roman" w:hAnsi="Times New Roman" w:cs="Times New Roman"/>
+          <w:sz w:val="22"/>
+          <w:szCs w:val="22"/>
+        </w:rPr>
+        <w:t xml:space="preserve">), pour les autres, les instances sont écrits sous la forme </w:t>
+      </w:r>
+      <w:r>
+        <w:rPr>
+          <w:rFonts w:ascii="Cascadia Code" w:hAnsi="Cascadia Code" w:cs="Cascadia Code"/>
+          <w:sz w:val="18"/>
+          <w:szCs w:val="18"/>
+        </w:rPr>
+        <w:t xml:space="preserve">[nom de la </w:t>
+      </w:r>
+      <w:proofErr w:type="gramStart"/>
+      <w:r>
+        <w:rPr>
+          <w:rFonts w:ascii="Cascadia Code" w:hAnsi="Cascadia Code" w:cs="Cascadia Code"/>
+          <w:sz w:val="18"/>
+          <w:szCs w:val="18"/>
+        </w:rPr>
+        <w:t>séquence]_</w:t>
+      </w:r>
+      <w:proofErr w:type="gramEnd"/>
+      <w:r>
+        <w:rPr>
+          <w:rFonts w:ascii="Cascadia Code" w:hAnsi="Cascadia Code" w:cs="Cascadia Code"/>
+          <w:sz w:val="18"/>
+          <w:szCs w:val="18"/>
+        </w:rPr>
+        <w:t>[titre]</w:t>
       </w:r>
       <w:r>
         <w:rPr>
@@ -7035,47 +6901,7 @@
           <w:sz w:val="22"/>
           <w:szCs w:val="22"/>
         </w:rPr>
-        <w:t>G</w:t>
-      </w:r>
-      <w:r>
-        <w:rPr>
-          <w:rFonts w:ascii="Times New Roman" w:hAnsi="Times New Roman" w:cs="Times New Roman"/>
-          <w:i/>
-          <w:iCs/>
-          <w:sz w:val="22"/>
-          <w:szCs w:val="22"/>
-        </w:rPr>
-        <w:t>14</w:t>
-      </w:r>
-      <w:r>
-        <w:rPr>
-          <w:rFonts w:ascii="Times New Roman" w:hAnsi="Times New Roman" w:cs="Times New Roman"/>
-          <w:i/>
-          <w:iCs/>
-          <w:sz w:val="22"/>
-          <w:szCs w:val="22"/>
-        </w:rPr>
-        <w:t>_</w:t>
-      </w:r>
-      <w:r>
-        <w:rPr>
-          <w:rFonts w:ascii="Times New Roman" w:hAnsi="Times New Roman" w:cs="Times New Roman"/>
-          <w:i/>
-          <w:iCs/>
-          <w:sz w:val="22"/>
-          <w:szCs w:val="22"/>
-        </w:rPr>
-        <w:t>Narrative</w:t>
-      </w:r>
-      <w:r>
-        <w:rPr>
-          <w:rFonts w:ascii="Times New Roman" w:hAnsi="Times New Roman" w:cs="Times New Roman"/>
-          <w:i/>
-          <w:iCs/>
-          <w:sz w:val="22"/>
-          <w:szCs w:val="22"/>
-        </w:rPr>
-        <w:t>-Stoff</w:t>
+        <w:t>G14_Narrative-Stoff</w:t>
       </w:r>
       <w:r>
         <w:rPr>
@@ -8128,6 +7954,7 @@
   <w:style w:type="character" w:default="1" w:styleId="Policepardfaut">
     <w:name w:val="Default Paragraph Font"/>
     <w:uiPriority w:val="1"/>
+    <w:semiHidden/>
     <w:unhideWhenUsed/>
   </w:style>
   <w:style w:type="table" w:default="1" w:styleId="TableauNormal">

</xml_diff>